<commit_message>
Change author name to Akshata Kapre
</commit_message>
<xml_diff>
--- a/Loan_Approval_Prediction_Report.docx
+++ b/Loan_Approval_Prediction_Report.docx
@@ -37,7 +37,7 @@
         <w:rPr>
           <w:sz w:val="22"/>
         </w:rPr>
-        <w:t xml:space="preserve">Author: Anurag Joshi  |  Dataset: Kaggle — Loan Prediction Problem Dataset</w:t>
+        <w:t xml:space="preserve">Author: Akshata Kapre  |  Dataset: Kaggle — Loan Prediction Problem Dataset</w:t>
       </w:r>
     </w:p>
     <w:p>
@@ -883,7 +883,7 @@
         <w:rPr>
           <w:sz w:val="20"/>
         </w:rPr>
-        <w:t xml:space="preserve">Project by Anurag Joshi  |  Dataset: Kaggle Loan Prediction Problem  |  Built with IBM Bob + Streamlit</w:t>
+        <w:t xml:space="preserve">Project by Akshata Kapre  |  Dataset: Kaggle Loan Prediction Problem  |  Built with IBM Bob + Streamlit</w:t>
       </w:r>
     </w:p>
     <w:p>
@@ -924,7 +924,7 @@
           <w:color w:val="666666"/>
           <w:sz w:val="20"/>
         </w:rPr>
-        <w:t xml:space="preserve">Author: Anurag Joshi   |   Tool: IBM Bob + Streamlit   |   Date: September 2026</w:t>
+        <w:t xml:space="preserve">Author: Akshata Kapre   |   Tool: IBM Bob + Streamlit   |   Date: September 2026</w:t>
       </w:r>
     </w:p>
     <w:p>
@@ -2594,7 +2594,7 @@
           <w:color w:val="888888"/>
           <w:sz w:val="18"/>
         </w:rPr>
-        <w:t xml:space="preserve">Project by Anurag Joshi  |  IBM Bob + Streamlit  |  Dataset: Kaggle Loan Prediction Problem  |  September 2026</w:t>
+        <w:t xml:space="preserve">Project by Akshata Kapre  |  IBM Bob + Streamlit  |  Dataset: Kaggle Loan Prediction Problem  |  September 2026</w:t>
       </w:r>
     </w:p>
     <w:sectPr>

</xml_diff>